<commit_message>
Fix blank cells in dataset report tables
Co-Authored-By: Claude Sonnet 5.5 <noreply@anthropic.com>
</commit_message>
<xml_diff>
--- a/report/Dataset_Report.docx
+++ b/report/Dataset_Report.docx
@@ -91,7 +91,7 @@
           </w:tcPr>
           <w:p>
             <w:r>
-              <w:t>interactions CSV</w:t>
+              <w:t>Interactions CSV</w:t>
             </w:r>
           </w:p>
         </w:tc>
@@ -122,7 +122,9 @@
             <w:tcW w:type="dxa" w:w="2880"/>
           </w:tcPr>
           <w:p>
-            <w:r/>
+            <w:r>
+              <w:t>Interactions CSV</w:t>
+            </w:r>
           </w:p>
         </w:tc>
         <w:tc>
@@ -152,7 +154,9 @@
             <w:tcW w:type="dxa" w:w="2880"/>
           </w:tcPr>
           <w:p>
-            <w:r/>
+            <w:r>
+              <w:t>Interactions CSV</w:t>
+            </w:r>
           </w:p>
         </w:tc>
         <w:tc>
@@ -182,7 +186,9 @@
             <w:tcW w:type="dxa" w:w="2880"/>
           </w:tcPr>
           <w:p>
-            <w:r/>
+            <w:r>
+              <w:t>Interactions CSV</w:t>
+            </w:r>
           </w:p>
         </w:tc>
         <w:tc>
@@ -213,7 +219,7 @@
           </w:tcPr>
           <w:p>
             <w:r>
-              <w:t>metadata JSONL</w:t>
+              <w:t>Metadata JSONL</w:t>
             </w:r>
           </w:p>
         </w:tc>
@@ -223,7 +229,7 @@
           </w:tcPr>
           <w:p>
             <w:r>
-              <w:t>parent_asin, title</w:t>
+              <w:t>parent_asin</w:t>
             </w:r>
           </w:p>
         </w:tc>
@@ -233,7 +239,7 @@
           </w:tcPr>
           <w:p>
             <w:r>
-              <w:t>product ID and name</w:t>
+              <w:t>product ID (joins to the interactions)</w:t>
             </w:r>
           </w:p>
         </w:tc>
@@ -244,7 +250,41 @@
             <w:tcW w:type="dxa" w:w="2880"/>
           </w:tcPr>
           <w:p>
-            <w:r/>
+            <w:r>
+              <w:t>Metadata JSONL</w:t>
+            </w:r>
+          </w:p>
+        </w:tc>
+        <w:tc>
+          <w:tcPr>
+            <w:tcW w:type="dxa" w:w="2880"/>
+          </w:tcPr>
+          <w:p>
+            <w:r>
+              <w:t>title</w:t>
+            </w:r>
+          </w:p>
+        </w:tc>
+        <w:tc>
+          <w:tcPr>
+            <w:tcW w:type="dxa" w:w="2880"/>
+          </w:tcPr>
+          <w:p>
+            <w:r>
+              <w:t>product name</w:t>
+            </w:r>
+          </w:p>
+        </w:tc>
+      </w:tr>
+      <w:tr>
+        <w:tc>
+          <w:tcPr>
+            <w:tcW w:type="dxa" w:w="2880"/>
+          </w:tcPr>
+          <w:p>
+            <w:r>
+              <w:t>Metadata JSONL</w:t>
+            </w:r>
           </w:p>
         </w:tc>
         <w:tc>
@@ -274,7 +314,9 @@
             <w:tcW w:type="dxa" w:w="2880"/>
           </w:tcPr>
           <w:p>
-            <w:r/>
+            <w:r>
+              <w:t>Metadata JSONL</w:t>
+            </w:r>
           </w:p>
         </w:tc>
         <w:tc>
@@ -1055,7 +1097,9 @@
             <w:tcW w:type="dxa" w:w="1728"/>
           </w:tcPr>
           <w:p>
-            <w:r/>
+            <w:r>
+              <w:t>Statistic</w:t>
+            </w:r>
           </w:p>
         </w:tc>
         <w:tc>

</xml_diff>